<commit_message>
reference no alberta YuHaoran Calgary
</commit_message>
<xml_diff>
--- a/referenceLetter/reference Li Cong Zhang Jinrui.docx
+++ b/referenceLetter/reference Li Cong Zhang Jinrui.docx
@@ -244,7 +244,7 @@
           <w:tab w:val="left" w:pos="5449"/>
         </w:tabs>
         <w:rPr>
-          <w:rFonts w:ascii="Times New Roman" w:eastAsia="黑体" w:hAnsi="Times New Roman" w:cs="Times New Roman" w:hint="eastAsia"/>
+          <w:rFonts w:ascii="Times New Roman" w:eastAsia="黑体" w:hAnsi="Times New Roman" w:cs="Times New Roman"/>
           <w:color w:val="000000"/>
           <w:szCs w:val="21"/>
           <w:lang w:bidi="ar"/>
@@ -334,27 +334,7 @@
           <w:szCs w:val="21"/>
           <w:lang w:bidi="ar"/>
         </w:rPr>
-        <w:t xml:space="preserve"> course at Jilin University, for admission to the graduate program at the </w:t>
-      </w:r>
-      <w:r>
-        <w:rPr>
-          <w:rFonts w:ascii="Times New Roman" w:eastAsia="黑体" w:hAnsi="Times New Roman" w:cs="Times New Roman"/>
-          <w:b/>
-          <w:bCs/>
-          <w:color w:val="000000"/>
-          <w:szCs w:val="21"/>
-          <w:lang w:bidi="ar"/>
-        </w:rPr>
-        <w:t>University of Alberta</w:t>
-      </w:r>
-      <w:r>
-        <w:rPr>
-          <w:rFonts w:ascii="Times New Roman" w:eastAsia="黑体" w:hAnsi="Times New Roman" w:cs="Times New Roman"/>
-          <w:color w:val="000000"/>
-          <w:szCs w:val="21"/>
-          <w:lang w:bidi="ar"/>
-        </w:rPr>
-        <w:t xml:space="preserve">. </w:t>
+        <w:t xml:space="preserve"> course at Jilin University, for admission to the graduate program. </w:t>
       </w:r>
       <w:proofErr w:type="spellStart"/>
       <w:r>
@@ -589,7 +569,7 @@
           <w:szCs w:val="21"/>
           <w:lang w:bidi="ar"/>
         </w:rPr>
-        <w:t xml:space="preserve"> possesses the intellectual rigor, self-discipline, and creativity required for graduate-level research. He has both the theoretical foundation and practical ability to succeed in advanced study, and I strongly recommend him for admission to the graduate program at the University of Alberta.</w:t>
+        <w:t xml:space="preserve"> possesses the intellectual rigor, self-discipline, and creativity required for graduate-level research. He has both the theoretical foundation and practical ability to succeed in advanced study, and I strongly recommend him for admission to the graduate program.</w:t>
       </w:r>
     </w:p>
     <w:p>
@@ -1547,6 +1527,7 @@
   <w:style w:type="character" w:default="1" w:styleId="a0">
     <w:name w:val="Default Paragraph Font"/>
     <w:uiPriority w:val="1"/>
+    <w:semiHidden/>
     <w:unhideWhenUsed/>
   </w:style>
   <w:style w:type="table" w:default="1" w:styleId="a1">

</xml_diff>